<commit_message>
Added a better RAG support
</commit_message>
<xml_diff>
--- a/JoYS-2026/T323_Logbook.docx
+++ b/JoYS-2026/T323_Logbook.docx
@@ -548,21 +548,8 @@
             <w:shd w:fill="FFFFFF" w:val="clear"/>
           </w:tcPr>
           <w:p>
-            <w:pPr>
-              <w:pStyle w:val="Normal"/>
-              <w:jc w:val="start"/>
-              <w:rPr/>
-            </w:pPr>
-            <w:r>
-              <w:rPr>
-                <w:rFonts w:eastAsia="Arial" w:cs="Arial"/>
-                <w:b w:val="false"/>
-                <w:bCs w:val="false"/>
-                <w:color w:val="050505"/>
-                <w:sz w:val="20"/>
-                <w:szCs w:val="20"/>
-              </w:rPr>
-              <w:t>v1.0</w:t>
+            <w:r>
+              <w:t>v1.1</w:t>
             </w:r>
           </w:p>
         </w:tc>
@@ -613,21 +600,8 @@
             <w:shd w:fill="FFFFFF" w:val="clear"/>
           </w:tcPr>
           <w:p>
-            <w:pPr>
-              <w:pStyle w:val="Normal"/>
-              <w:jc w:val="start"/>
-              <w:rPr/>
-            </w:pPr>
-            <w:r>
-              <w:rPr>
-                <w:rFonts w:eastAsia="Arial" w:cs="Arial"/>
-                <w:b w:val="false"/>
-                <w:bCs w:val="false"/>
-                <w:color w:val="050505"/>
-                <w:sz w:val="20"/>
-                <w:szCs w:val="20"/>
-              </w:rPr>
-              <w:t>March 2026</w:t>
+            <w:r>
+              <w:t>May 2026</w:t>
             </w:r>
           </w:p>
         </w:tc>
@@ -2505,6 +2479,38 @@
           </w:p>
         </w:tc>
       </w:tr>
+      <w:tr>
+        <w:tc>
+          <w:tcPr>
+            <w:tcW w:type="dxa" w:w="2600"/>
+          </w:tcPr>
+          <w:p>
+            <w:r>
+              <w:t>RAG (Retrieval-Augmented Generation)</w:t>
+            </w:r>
+          </w:p>
+        </w:tc>
+        <w:tc>
+          <w:tcPr>
+            <w:tcW w:type="dxa" w:w="3100"/>
+          </w:tcPr>
+          <w:p>
+            <w:r>
+              <w:t>LlamaIndex + ChromaDB + ONNX (all-MiniLM-L6-v2)</w:t>
+            </w:r>
+          </w:p>
+        </w:tc>
+        <w:tc>
+          <w:tcPr>
+            <w:tcW w:type="dxa" w:w="3800"/>
+          </w:tcPr>
+          <w:p>
+            <w:r>
+              <w:t>Custom engine → LlamaIndex migration (May 2026). Offline embedding via ONNX runtime (no torch). PDF/DOCX/XLSX/CSV/PPTX ingestion. Hallucination guard via FaithfulnessEvaluator (B→C: retry→abstain). ChromaDB persistent store with cosine similarity.</w:t>
+            </w:r>
+          </w:p>
+        </w:tc>
+      </w:tr>
     </w:tbl>
     <w:p>
       <w:pPr>
@@ -3221,6 +3227,38 @@
             <w:r>
               <w:rPr/>
               <w:t>Uses python’s FastMCP,CLAHE,Otsu and Gaussain filters to add Filtering cabiblities to AI</w:t>
+            </w:r>
+          </w:p>
+        </w:tc>
+      </w:tr>
+      <w:tr>
+        <w:tc>
+          <w:tcPr>
+            <w:tcW w:type="dxa" w:w="2600"/>
+          </w:tcPr>
+          <w:p>
+            <w:r>
+              <w:t>Vector Store</w:t>
+            </w:r>
+          </w:p>
+        </w:tc>
+        <w:tc>
+          <w:tcPr>
+            <w:tcW w:type="dxa" w:w="3100"/>
+          </w:tcPr>
+          <w:p>
+            <w:r>
+              <w:t>ChromaDB (persistent)</w:t>
+            </w:r>
+          </w:p>
+        </w:tc>
+        <w:tc>
+          <w:tcPr>
+            <w:tcW w:type="dxa" w:w="3800"/>
+          </w:tcPr>
+          <w:p>
+            <w:r>
+              <w:t>Local vector database for RAG; stores 600+ chunks from docs/; no cloud dependency.</w:t>
             </w:r>
           </w:p>
         </w:tc>
@@ -4587,6 +4625,28 @@
           </w:p>
         </w:tc>
       </w:tr>
+      <w:tr>
+        <w:tc>
+          <w:tcPr>
+            <w:tcW w:type="dxa" w:w="1597"/>
+          </w:tcPr>
+          <w:p>
+            <w:r>
+              <w:t>Feb–May 2026</w:t>
+            </w:r>
+          </w:p>
+        </w:tc>
+        <w:tc>
+          <w:tcPr>
+            <w:tcW w:type="dxa" w:w="7903"/>
+          </w:tcPr>
+          <w:p>
+            <w:r>
+              <w:t>RAG engine development: custom ChromaDB+ONNX (Feb) → full LlamaIndex migration (May). SentenceSplitter, IngestionPipeline, VectorStoreIndex, FaithfulnessEvaluator. Multi-format document ingestion (.pdf .docx .csv .xlsx .pptx .odt .html).</w:t>
+            </w:r>
+          </w:p>
+        </w:tc>
+      </w:tr>
     </w:tbl>
     <w:p>
       <w:pPr>
@@ -5021,6 +5081,28 @@
                 <w:szCs w:val="20"/>
               </w:rPr>
               <w:t>Arabic competition report writing begun; chapters drafted covering background, methodology, system design, results</w:t>
+            </w:r>
+          </w:p>
+        </w:tc>
+      </w:tr>
+      <w:tr>
+        <w:tc>
+          <w:tcPr>
+            <w:tcW w:type="dxa" w:w="1597"/>
+          </w:tcPr>
+          <w:p>
+            <w:r>
+              <w:t>May 2026</w:t>
+            </w:r>
+          </w:p>
+        </w:tc>
+        <w:tc>
+          <w:tcPr>
+            <w:tcW w:type="dxa" w:w="7903"/>
+          </w:tcPr>
+          <w:p>
+            <w:r>
+              <w:t>LlamaIndex migration complete: OnnxEmbedding adapter, ChromaVectorStore, FaithfulnessEvaluator with B→C guard (retry→abstain). Document ingestion expanded to 16 formats. evaluate_hallucinations config flag added.</w:t>
             </w:r>
           </w:p>
         </w:tc>
@@ -5394,6 +5476,50 @@
                 <w:szCs w:val="20"/>
               </w:rPr>
               <w:t>Deploy on Raspberry Pi 2B for hardware validation testing</w:t>
+            </w:r>
+          </w:p>
+        </w:tc>
+      </w:tr>
+      <w:tr>
+        <w:tc>
+          <w:tcPr>
+            <w:tcW w:type="dxa" w:w="1597"/>
+          </w:tcPr>
+          <w:p>
+            <w:r>
+              <w:t>DONE</w:t>
+            </w:r>
+          </w:p>
+        </w:tc>
+        <w:tc>
+          <w:tcPr>
+            <w:tcW w:type="dxa" w:w="7903"/>
+          </w:tcPr>
+          <w:p>
+            <w:r>
+              <w:t>RAG engine: LlamaIndex migration complete. ChromaDB with 600+ medical chunks indexed from documentation. PDF/Office ingestion pipeline operational.</w:t>
+            </w:r>
+          </w:p>
+        </w:tc>
+      </w:tr>
+      <w:tr>
+        <w:tc>
+          <w:tcPr>
+            <w:tcW w:type="dxa" w:w="1597"/>
+          </w:tcPr>
+          <w:p>
+            <w:r>
+              <w:t>DONE</w:t>
+            </w:r>
+          </w:p>
+        </w:tc>
+        <w:tc>
+          <w:tcPr>
+            <w:tcW w:type="dxa" w:w="7903"/>
+          </w:tcPr>
+          <w:p>
+            <w:r>
+              <w:t>Hallucination guard: FaithfulnessEvaluator integrated with retry→abstain pattern (B→C). Config flag evaluate_hallucinations (default: off).</w:t>
             </w:r>
           </w:p>
         </w:tc>
@@ -6487,6 +6613,48 @@
           </w:p>
         </w:tc>
       </w:tr>
+      <w:tr>
+        <w:tc>
+          <w:tcPr>
+            <w:tcW w:type="dxa" w:w="700"/>
+          </w:tcPr>
+          <w:p>
+            <w:r>
+              <w:t>D8</w:t>
+            </w:r>
+          </w:p>
+        </w:tc>
+        <w:tc>
+          <w:tcPr>
+            <w:tcW w:type="dxa" w:w="2300"/>
+          </w:tcPr>
+          <w:p>
+            <w:r>
+              <w:t>Adopt LlamaIndex as full RAG framework</w:t>
+            </w:r>
+          </w:p>
+        </w:tc>
+        <w:tc>
+          <w:tcPr>
+            <w:tcW w:type="dxa" w:w="3197"/>
+          </w:tcPr>
+          <w:p>
+            <w:r>
+              <w:t>Custom 409-line RAG engine (raw ChromaDB + ONNX) lacked PDF support, hallucination evaluation, and standardized chunking. LlamaIndex 0.14 provides VectorStoreIndex, SentenceSplitter, FaithfulnessEvaluator, and IngestionPipeline out of the box. Installed packages: llama-index-core, llama-index-vector-stores-chroma, llama-index-llms-openai. Pinned versions prevent upstream churn.</w:t>
+            </w:r>
+          </w:p>
+        </w:tc>
+        <w:tc>
+          <w:tcPr>
+            <w:tcW w:type="dxa" w:w="3303"/>
+          </w:tcPr>
+          <w:p>
+            <w:r>
+              <w:t>Keep custom 409-line engine (no PDF, no eval, no standard chunking); use separate pypdf/tesseract for PDFs (more code to maintain)</w:t>
+            </w:r>
+          </w:p>
+        </w:tc>
+      </w:tr>
     </w:tbl>
     <w:p>
       <w:pPr>
@@ -7596,6 +7764,48 @@
                 <w:szCs w:val="20"/>
               </w:rPr>
               <w:t>Not yet resolved. Current workaround: single-user access enforced. Planned fix: migrate to PostgreSQL or SQLite WAL mode for Enterprise edition multi-user support</w:t>
+            </w:r>
+          </w:p>
+        </w:tc>
+      </w:tr>
+      <w:tr>
+        <w:tc>
+          <w:tcPr>
+            <w:tcW w:type="dxa" w:w="700"/>
+          </w:tcPr>
+          <w:p>
+            <w:r>
+              <w:t>I8</w:t>
+            </w:r>
+          </w:p>
+        </w:tc>
+        <w:tc>
+          <w:tcPr>
+            <w:tcW w:type="dxa" w:w="2300"/>
+          </w:tcPr>
+          <w:p>
+            <w:r>
+              <w:t>20GB medical corpus (PDFs, books, papers) cannot be ingested — engine only supports .md/.txt</w:t>
+            </w:r>
+          </w:p>
+        </w:tc>
+        <w:tc>
+          <w:tcPr>
+            <w:tcW w:type="dxa" w:w="3197"/>
+          </w:tcPr>
+          <w:p>
+            <w:r>
+              <w:t>Original RAG engine used raw ChromaDB with hardcoded extension filter: .md .txt .yaml .yml .json</w:t>
+            </w:r>
+          </w:p>
+        </w:tc>
+        <w:tc>
+          <w:tcPr>
+            <w:tcW w:type="dxa" w:w="3303"/>
+          </w:tcPr>
+          <w:p>
+            <w:r>
+              <w:t>Migrated to LlamaIndex with pypdf (PDF), python-docx (DOCX), openpyxl (XLSX), csv (CSV), python-pptx (PPTX), odfpy (ODT/ODS/ODP), and HTMLParser (HTML). IngestionPipeline handles chunking + embedding in one step. New supported_extensions set covers 16 formats.</w:t>
             </w:r>
           </w:p>
         </w:tc>
@@ -13684,6 +13894,134 @@
                 <w:sz w:val="18"/>
                 <w:szCs w:val="18"/>
               </w:rPr>
+              <w:t>PLANNED</w:t>
+            </w:r>
+          </w:p>
+        </w:tc>
+      </w:tr>
+      <w:tr>
+        <w:tc>
+          <w:tcPr>
+            <w:tcW w:type="dxa" w:w="4500"/>
+          </w:tcPr>
+          <w:p>
+            <w:r>
+              <w:t>RAG engine (ChromaDB + ONNX embedding)</w:t>
+            </w:r>
+          </w:p>
+        </w:tc>
+        <w:tc>
+          <w:tcPr>
+            <w:tcW w:type="dxa" w:w="3000"/>
+          </w:tcPr>
+          <w:p>
+            <w:r>
+              <w:t>Home + Enterprise</w:t>
+            </w:r>
+          </w:p>
+        </w:tc>
+        <w:tc>
+          <w:tcPr>
+            <w:tcW w:type="dxa" w:w="2000"/>
+          </w:tcPr>
+          <w:p>
+            <w:r>
+              <w:t>DONE</w:t>
+            </w:r>
+          </w:p>
+        </w:tc>
+      </w:tr>
+      <w:tr>
+        <w:tc>
+          <w:tcPr>
+            <w:tcW w:type="dxa" w:w="4500"/>
+          </w:tcPr>
+          <w:p>
+            <w:r>
+              <w:t>Multi-format document ingestion (.pdf .docx .xlsx .csv .pptx .odt .html)</w:t>
+            </w:r>
+          </w:p>
+        </w:tc>
+        <w:tc>
+          <w:tcPr>
+            <w:tcW w:type="dxa" w:w="3000"/>
+          </w:tcPr>
+          <w:p>
+            <w:r>
+              <w:t>Home + Enterprise</w:t>
+            </w:r>
+          </w:p>
+        </w:tc>
+        <w:tc>
+          <w:tcPr>
+            <w:tcW w:type="dxa" w:w="2000"/>
+          </w:tcPr>
+          <w:p>
+            <w:r>
+              <w:t>DONE</w:t>
+            </w:r>
+          </w:p>
+        </w:tc>
+      </w:tr>
+      <w:tr>
+        <w:tc>
+          <w:tcPr>
+            <w:tcW w:type="dxa" w:w="4500"/>
+          </w:tcPr>
+          <w:p>
+            <w:r>
+              <w:t>Hallucination evaluation guard (FaithfulnessEvaluator)</w:t>
+            </w:r>
+          </w:p>
+        </w:tc>
+        <w:tc>
+          <w:tcPr>
+            <w:tcW w:type="dxa" w:w="3000"/>
+          </w:tcPr>
+          <w:p>
+            <w:r>
+              <w:t>Home + Enterprise</w:t>
+            </w:r>
+          </w:p>
+        </w:tc>
+        <w:tc>
+          <w:tcPr>
+            <w:tcW w:type="dxa" w:w="2000"/>
+          </w:tcPr>
+          <w:p>
+            <w:r>
+              <w:t>DONE</w:t>
+            </w:r>
+          </w:p>
+        </w:tc>
+      </w:tr>
+      <w:tr>
+        <w:tc>
+          <w:tcPr>
+            <w:tcW w:type="dxa" w:w="4500"/>
+          </w:tcPr>
+          <w:p>
+            <w:r>
+              <w:t>20GB medical corpus ingestion pipeline</w:t>
+            </w:r>
+          </w:p>
+        </w:tc>
+        <w:tc>
+          <w:tcPr>
+            <w:tcW w:type="dxa" w:w="3000"/>
+          </w:tcPr>
+          <w:p>
+            <w:r>
+              <w:t>Home + Enterprise</w:t>
+            </w:r>
+          </w:p>
+        </w:tc>
+        <w:tc>
+          <w:tcPr>
+            <w:tcW w:type="dxa" w:w="2000"/>
+          </w:tcPr>
+          <w:p>
+            <w:r>
               <w:t>PLANNED</w:t>
             </w:r>
           </w:p>
@@ -14800,6 +15138,72 @@
                 <w:szCs w:val="20"/>
               </w:rPr>
               <w:t>github.com/umbrella-infrastructure — Parent org for Hakeem, Mada, Najm</w:t>
+            </w:r>
+          </w:p>
+        </w:tc>
+      </w:tr>
+      <w:tr>
+        <w:tc>
+          <w:tcPr>
+            <w:tcW w:type="dxa" w:w="2797"/>
+          </w:tcPr>
+          <w:p>
+            <w:r>
+              <w:t>LlamaIndex</w:t>
+            </w:r>
+          </w:p>
+        </w:tc>
+        <w:tc>
+          <w:tcPr>
+            <w:tcW w:type="dxa" w:w="6703"/>
+          </w:tcPr>
+          <w:p>
+            <w:r>
+              <w:t>docs.llamaindex.ai — RAG framework used for vector indexing, chunking, retrieval, and faithfulness evaluation. Version 0.14.22 pinned.</w:t>
+            </w:r>
+          </w:p>
+        </w:tc>
+      </w:tr>
+      <w:tr>
+        <w:tc>
+          <w:tcPr>
+            <w:tcW w:type="dxa" w:w="2797"/>
+          </w:tcPr>
+          <w:p>
+            <w:r>
+              <w:t>ONNX Runtime (all-MiniLM-L6-v2)</w:t>
+            </w:r>
+          </w:p>
+        </w:tc>
+        <w:tc>
+          <w:tcPr>
+            <w:tcW w:type="dxa" w:w="6703"/>
+          </w:tcPr>
+          <w:p>
+            <w:r>
+              <w:t>onnxruntime.ai — Local embedding model used for RAG. No torch dependency. ~90MB on disk.</w:t>
+            </w:r>
+          </w:p>
+        </w:tc>
+      </w:tr>
+      <w:tr>
+        <w:tc>
+          <w:tcPr>
+            <w:tcW w:type="dxa" w:w="2797"/>
+          </w:tcPr>
+          <w:p>
+            <w:r>
+              <w:t>ChromaDB</w:t>
+            </w:r>
+          </w:p>
+        </w:tc>
+        <w:tc>
+          <w:tcPr>
+            <w:tcW w:type="dxa" w:w="6703"/>
+          </w:tcPr>
+          <w:p>
+            <w:r>
+              <w:t>docs.trychroma.com — Persistent vector store for medical document embeddings. Cosine similarity index.</w:t>
             </w:r>
           </w:p>
         </w:tc>

</xml_diff>